<commit_message>
Add A* and GBFS dynamic pathfinding implementation
</commit_message>
<xml_diff>
--- a/AI_A1_23F0719&23F0658.docx
+++ b/AI_A1_23F0719&23F0658.docx
@@ -23,53 +23,62 @@
           <w:sz w:val="36"/>
           <w:szCs w:val="36"/>
         </w:rPr>
-        <w:t xml:space="preserve"> M. Alyan Tariq &amp; Sanial</w:t>
-      </w:r>
+        <w:t xml:space="preserve"> M. Alyan Tariq &amp; </w:t>
+      </w:r>
+      <w:proofErr w:type="spellStart"/>
       <w:r>
         <w:rPr>
           <w:sz w:val="36"/>
           <w:szCs w:val="36"/>
         </w:rPr>
-        <w:br/>
-      </w:r>
-      <w:r>
-        <w:rPr>
-          <w:b/>
-          <w:bCs/>
+        <w:t>Sanial</w:t>
+      </w:r>
+      <w:proofErr w:type="spellEnd"/>
+      <w:r>
+        <w:rPr>
           <w:sz w:val="36"/>
           <w:szCs w:val="36"/>
         </w:rPr>
-        <w:t>CLASS:</w:t>
-      </w:r>
-      <w:r>
-        <w:rPr>
+        <w:br/>
+      </w:r>
+      <w:r>
+        <w:rPr>
+          <w:b/>
+          <w:bCs/>
           <w:sz w:val="36"/>
           <w:szCs w:val="36"/>
         </w:rPr>
-        <w:t xml:space="preserve"> BS(CS)-6D</w:t>
-      </w:r>
-    </w:p>
-    <w:p>
-      <w:pPr>
+        <w:t>CLASS:</w:t>
+      </w:r>
+      <w:r>
         <w:rPr>
           <w:sz w:val="36"/>
           <w:szCs w:val="36"/>
         </w:rPr>
-      </w:pPr>
-      <w:r>
-        <w:rPr>
-          <w:b/>
-          <w:bCs/>
+        <w:t xml:space="preserve"> BS(CS)-6D</w:t>
+      </w:r>
+    </w:p>
+    <w:p>
+      <w:pPr>
+        <w:rPr>
           <w:sz w:val="36"/>
           <w:szCs w:val="36"/>
         </w:rPr>
-        <w:t>ROLL NO.</w:t>
-      </w:r>
-      <w:r>
-        <w:rPr>
+      </w:pPr>
+      <w:r>
+        <w:rPr>
+          <w:b/>
+          <w:bCs/>
           <w:sz w:val="36"/>
           <w:szCs w:val="36"/>
         </w:rPr>
+        <w:t>ROLL NO.</w:t>
+      </w:r>
+      <w:r>
+        <w:rPr>
+          <w:sz w:val="36"/>
+          <w:szCs w:val="36"/>
+        </w:rPr>
         <w:t xml:space="preserve"> 23F-0719 &amp; 23F-0658</w:t>
       </w:r>
     </w:p>
@@ -136,20 +145,8 @@
           <w:szCs w:val="24"/>
           <w:bdr w:val="none" w:sz="0" w:space="0" w:color="auto" w:frame="1"/>
         </w:rPr>
-        <w:t>The objective of this task was to build an AI Pathfinder to visualize how various "blind" or uninformed search algorithms navigate a grid environment from a Start Point (S) to a Target Point (T</w:t>
-      </w:r>
-      <w:proofErr w:type="gramStart"/>
-      <w:r>
-        <w:rPr>
-          <w:rFonts w:eastAsia="Times New Roman" w:cstheme="minorHAnsi"/>
-          <w:color w:val="1F1F1F"/>
-          <w:sz w:val="24"/>
-          <w:szCs w:val="24"/>
-          <w:bdr w:val="none" w:sz="0" w:space="0" w:color="auto" w:frame="1"/>
-        </w:rPr>
-        <w:t>) .</w:t>
-      </w:r>
-      <w:proofErr w:type="gramEnd"/>
+        <w:t>The objective of this task was to build an AI Pathfinder to visualize how various "blind" or uninformed search algorithms navigate a grid environment from a Start Point (S) to a Target Point (T) .</w:t>
+      </w:r>
     </w:p>
     <w:p>
       <w:pPr>
@@ -181,7 +178,29 @@
           <w:szCs w:val="24"/>
           <w:bdr w:val="none" w:sz="0" w:space="0" w:color="auto" w:frame="1"/>
         </w:rPr>
-        <w:t xml:space="preserve"> The environment is a 20x20 grid developed using Python. To fulfill the visualization requirement directly within a Jupyter Notebook environment, </w:t>
+        <w:t xml:space="preserve"> The environment is a 20x20 grid developed using Python. To fulfill the visualization requirement directly within a </w:t>
+      </w:r>
+      <w:proofErr w:type="spellStart"/>
+      <w:r>
+        <w:rPr>
+          <w:rFonts w:eastAsia="Times New Roman" w:cstheme="minorHAnsi"/>
+          <w:color w:val="1F1F1F"/>
+          <w:sz w:val="24"/>
+          <w:szCs w:val="24"/>
+          <w:bdr w:val="none" w:sz="0" w:space="0" w:color="auto" w:frame="1"/>
+        </w:rPr>
+        <w:t>Jupyter</w:t>
+      </w:r>
+      <w:proofErr w:type="spellEnd"/>
+      <w:r>
+        <w:rPr>
+          <w:rFonts w:eastAsia="Times New Roman" w:cstheme="minorHAnsi"/>
+          <w:color w:val="1F1F1F"/>
+          <w:sz w:val="24"/>
+          <w:szCs w:val="24"/>
+          <w:bdr w:val="none" w:sz="0" w:space="0" w:color="auto" w:frame="1"/>
+        </w:rPr>
+        <w:t xml:space="preserve"> Notebook environment, </w:t>
       </w:r>
       <w:r>
         <w:rPr>
@@ -203,37 +222,36 @@
         </w:rPr>
         <w:t xml:space="preserve"> and </w:t>
       </w:r>
-      <w:r>
-        <w:rPr>
-          <w:rFonts w:eastAsia="Times New Roman" w:cstheme="minorHAnsi"/>
-          <w:sz w:val="24"/>
-          <w:szCs w:val="24"/>
-          <w:bdr w:val="none" w:sz="0" w:space="0" w:color="auto" w:frame="1"/>
-        </w:rPr>
-        <w:t xml:space="preserve">IPython.display </w:t>
-      </w:r>
-      <w:r>
-        <w:rPr>
-          <w:rFonts w:eastAsia="Times New Roman" w:cstheme="minorHAnsi"/>
-          <w:color w:val="1F1F1F"/>
-          <w:sz w:val="24"/>
-          <w:szCs w:val="24"/>
-          <w:bdr w:val="none" w:sz="0" w:space="0" w:color="auto" w:frame="1"/>
-        </w:rPr>
-        <w:t xml:space="preserve">were utilized to create a real-time, step-by-step animation of the algorithms "flooding" the grid. The graphical interface clearly distinguishes between unexplored nodes, frontier nodes (waiting in the queue/stack), explored nodes, and the final </w:t>
-      </w:r>
-      <w:proofErr w:type="gramStart"/>
-      <w:r>
-        <w:rPr>
-          <w:rFonts w:eastAsia="Times New Roman" w:cstheme="minorHAnsi"/>
-          <w:color w:val="1F1F1F"/>
-          <w:sz w:val="24"/>
-          <w:szCs w:val="24"/>
-          <w:bdr w:val="none" w:sz="0" w:space="0" w:color="auto" w:frame="1"/>
-        </w:rPr>
-        <w:t>path .</w:t>
-      </w:r>
-      <w:proofErr w:type="gramEnd"/>
+      <w:proofErr w:type="spellStart"/>
+      <w:r>
+        <w:rPr>
+          <w:rFonts w:eastAsia="Times New Roman" w:cstheme="minorHAnsi"/>
+          <w:sz w:val="24"/>
+          <w:szCs w:val="24"/>
+          <w:bdr w:val="none" w:sz="0" w:space="0" w:color="auto" w:frame="1"/>
+        </w:rPr>
+        <w:t>IPython.display</w:t>
+      </w:r>
+      <w:proofErr w:type="spellEnd"/>
+      <w:r>
+        <w:rPr>
+          <w:rFonts w:eastAsia="Times New Roman" w:cstheme="minorHAnsi"/>
+          <w:sz w:val="24"/>
+          <w:szCs w:val="24"/>
+          <w:bdr w:val="none" w:sz="0" w:space="0" w:color="auto" w:frame="1"/>
+        </w:rPr>
+        <w:t xml:space="preserve"> </w:t>
+      </w:r>
+      <w:r>
+        <w:rPr>
+          <w:rFonts w:eastAsia="Times New Roman" w:cstheme="minorHAnsi"/>
+          <w:color w:val="1F1F1F"/>
+          <w:sz w:val="24"/>
+          <w:szCs w:val="24"/>
+          <w:bdr w:val="none" w:sz="0" w:space="0" w:color="auto" w:frame="1"/>
+        </w:rPr>
+        <w:t>were utilized to create a real-time, step-by-step animation of the algorithms "flooding" the grid. The graphical interface clearly distinguishes between unexplored nodes, frontier nodes (waiting in the queue/stack), explored nodes, and the final path .</w:t>
+      </w:r>
     </w:p>
     <w:p>
       <w:pPr>
@@ -286,20 +304,8 @@
           <w:szCs w:val="24"/>
           <w:bdr w:val="none" w:sz="0" w:space="0" w:color="auto" w:frame="1"/>
         </w:rPr>
-        <w:t xml:space="preserve"> Node expansion strictly follows the mandated 8-way clockwise </w:t>
-      </w:r>
-      <w:proofErr w:type="gramStart"/>
-      <w:r>
-        <w:rPr>
-          <w:rFonts w:eastAsia="Times New Roman" w:cstheme="minorHAnsi"/>
-          <w:color w:val="1F1F1F"/>
-          <w:sz w:val="24"/>
-          <w:szCs w:val="24"/>
-          <w:bdr w:val="none" w:sz="0" w:space="0" w:color="auto" w:frame="1"/>
-        </w:rPr>
-        <w:t>order :</w:t>
-      </w:r>
-      <w:proofErr w:type="gramEnd"/>
+        <w:t xml:space="preserve"> Node expansion strictly follows the mandated 8-way clockwise order :</w:t>
+      </w:r>
     </w:p>
     <w:p>
       <w:pPr>
@@ -1508,6 +1514,7 @@
       </w:pPr>
       <w:r>
         <w:rPr>
+          <w:noProof/>
           <w:sz w:val="28"/>
           <w:szCs w:val="28"/>
         </w:rPr>
@@ -1691,6 +1698,7 @@
       </w:pPr>
       <w:r>
         <w:rPr>
+          <w:noProof/>
           <w:sz w:val="28"/>
           <w:szCs w:val="28"/>
         </w:rPr>
@@ -1870,6 +1878,7 @@
       </w:pPr>
       <w:r>
         <w:rPr>
+          <w:noProof/>
           <w:sz w:val="36"/>
           <w:szCs w:val="36"/>
         </w:rPr>
@@ -2070,6 +2079,7 @@
       </w:pPr>
       <w:r>
         <w:rPr>
+          <w:noProof/>
           <w:sz w:val="28"/>
           <w:szCs w:val="28"/>
         </w:rPr>
@@ -2254,6 +2264,7 @@
       </w:pPr>
       <w:r>
         <w:rPr>
+          <w:noProof/>
           <w:sz w:val="28"/>
           <w:szCs w:val="28"/>
         </w:rPr>
@@ -2433,6 +2444,7 @@
       </w:pPr>
       <w:r>
         <w:rPr>
+          <w:noProof/>
           <w:sz w:val="28"/>
           <w:szCs w:val="28"/>
         </w:rPr>
@@ -2478,58 +2490,43 @@
       <w:pPr>
         <w:spacing w:before="100" w:beforeAutospacing="1" w:after="0" w:line="240" w:lineRule="auto"/>
         <w:ind w:left="720"/>
+      </w:pPr>
+      <w:proofErr w:type="spellStart"/>
+      <w:r>
         <w:rPr>
           <w:sz w:val="28"/>
           <w:szCs w:val="28"/>
         </w:rPr>
-      </w:pPr>
-      <w:r>
-        <w:rPr>
-          <w:sz w:val="36"/>
-          <w:szCs w:val="36"/>
-        </w:rPr>
-        <w:br/>
-      </w:r>
-    </w:p>
-    <w:p>
-      <w:pPr>
+        <w:t>Github</w:t>
+      </w:r>
+      <w:proofErr w:type="spellEnd"/>
+      <w:r>
         <w:rPr>
           <w:sz w:val="28"/>
           <w:szCs w:val="28"/>
         </w:rPr>
-      </w:pPr>
-    </w:p>
-    <w:p>
-      <w:pPr>
+        <w:t xml:space="preserve"> Link:</w:t>
+      </w:r>
+      <w:r>
+        <w:t xml:space="preserve"> </w:t>
+      </w:r>
+    </w:p>
+    <w:p>
+      <w:pPr>
+        <w:spacing w:before="100" w:beforeAutospacing="1" w:after="0" w:line="240" w:lineRule="auto"/>
+        <w:ind w:left="720"/>
         <w:rPr>
           <w:sz w:val="28"/>
           <w:szCs w:val="28"/>
         </w:rPr>
       </w:pPr>
-    </w:p>
-    <w:p>
-      <w:pPr>
+      <w:r>
         <w:rPr>
           <w:sz w:val="28"/>
           <w:szCs w:val="28"/>
         </w:rPr>
-      </w:pPr>
-    </w:p>
-    <w:p>
-      <w:pPr>
-        <w:rPr>
-          <w:sz w:val="28"/>
-          <w:szCs w:val="28"/>
-        </w:rPr>
-      </w:pPr>
-    </w:p>
-    <w:p>
-      <w:pPr>
-        <w:rPr>
-          <w:sz w:val="28"/>
-          <w:szCs w:val="28"/>
-        </w:rPr>
-      </w:pPr>
+        <w:t>https://github.com/Alyan-T/uninformedsearchImplement/tree/main</w:t>
+      </w:r>
     </w:p>
     <w:p>
       <w:pPr>

</xml_diff>